<commit_message>
Agregar modal de confirmación para generación de documentos de designación de tribunal con validación de datos y descarga automática
</commit_message>
<xml_diff>
--- a/src/resources/templates/plantilla-designacion-tribunal.docx
+++ b/src/resources/templates/plantilla-designacion-tribunal.docx
@@ -64,12 +64,6 @@
                 <w:rFonts w:ascii="Tahoma" w:hAnsi="Tahoma" w:cs="Tahoma"/>
               </w:rPr>
             </w:pPr>
-            <w:r>
-              <w:rPr>
-                <w:rFonts w:ascii="Tahoma" w:hAnsi="Tahoma" w:cs="Tahoma"/>
-              </w:rPr>
-              <w:t xml:space="preserve">T.S </w:t>
-            </w:r>
             <w:r>
               <w:rPr>
                 <w:rFonts w:ascii="Tahoma" w:hAnsi="Tahoma" w:cs="Tahoma"/>

</xml_diff>